<commit_message>
working on function for different tests
</commit_message>
<xml_diff>
--- a/Writing/Lit review.docx
+++ b/Writing/Lit review.docx
@@ -11,6 +11,25 @@
       </w:r>
     </w:p>
     <w:p>
+      <w:r>
+        <w:t>Fitness observations:</w:t>
+      </w:r>
+    </w:p>
+    <w:p>
+      <w:r>
+        <w:t xml:space="preserve">WT grows better if not the same as the mutations </w:t>
+      </w:r>
+    </w:p>
+    <w:p>
+      <w:r>
+        <w:t>Some mutations grow worse (could be due to other factors and not temperature)</w:t>
+      </w:r>
+      <w:r>
+        <w:br/>
+      </w:r>
+    </w:p>
+    <w:p/>
+    <w:p>
       <w:pPr>
         <w:rPr>
           <w:b/>
@@ -154,7 +173,7 @@
           <w:b/>
           <w:bCs/>
         </w:rPr>
-        <w:t xml:space="preserve">: this underpins every chapter </w:t>
+        <w:t xml:space="preserve">: </w:t>
       </w:r>
     </w:p>
     <w:p>
@@ -214,7 +233,11 @@
         <w:t>. The drug t</w:t>
       </w:r>
       <w:r>
-        <w:t xml:space="preserve">argets the RNA polymerase by binding close to the beta subunit which blocks the elongation of synthesized RNA molecules, thereby leading to premature termination of transcription and ultimately cell death (Campbell et al., 2001). </w:t>
+        <w:t xml:space="preserve">argets the RNA polymerase by binding close to the beta subunit which blocks the </w:t>
+      </w:r>
+      <w:r>
+        <w:lastRenderedPageBreak/>
+        <w:t xml:space="preserve">elongation of synthesized RNA molecules, thereby leading to premature termination of transcription and ultimately cell death (Campbell et al., 2001). </w:t>
       </w:r>
       <w:r>
         <w:rPr>
@@ -248,852 +271,839 @@
         <w:rPr>
           <w:highlight w:val="yellow"/>
         </w:rPr>
-        <w:t xml:space="preserve"> gene encodes for 1342 amino </w:t>
-      </w:r>
-      <w:r>
-        <w:rPr>
-          <w:highlight w:val="yellow"/>
-        </w:rPr>
+        <w:t xml:space="preserve"> gene encodes for 1342 amino acids, previous studies done on Haemophilus influenzae, M. tuberculosis, Neisseria and Streptococcus pneumoniae indicate that resistance mutations only occur at a relatively small set of loci known as the rifampicin resistance-determining region (RRDR) (Goldstein, 2014).</w:t>
+      </w:r>
+      <w:r>
+        <w:t xml:space="preserve"> Through this relationship we have managed to evolve 28 unique E. coli strains each </w:t>
+      </w:r>
+      <w:proofErr w:type="spellStart"/>
+      <w:r>
+        <w:t>harboring</w:t>
+      </w:r>
+      <w:proofErr w:type="spellEnd"/>
+      <w:r>
+        <w:t xml:space="preserve"> a unique </w:t>
+      </w:r>
+      <w:proofErr w:type="spellStart"/>
+      <w:r>
+        <w:t>rpoB</w:t>
+      </w:r>
+      <w:proofErr w:type="spellEnd"/>
+      <w:r>
+        <w:t xml:space="preserve"> mutation. Going forward I will be using these mutations to test for fitness effects and the stochasticity. </w:t>
+      </w:r>
+    </w:p>
+    <w:p/>
+    <w:p>
+      <w:r>
+        <w:t xml:space="preserve">Chapter 1 Fitness </w:t>
+      </w:r>
+    </w:p>
+    <w:p>
+      <w:pPr>
+        <w:rPr>
+          <w:b/>
+          <w:bCs/>
+        </w:rPr>
+      </w:pPr>
+      <w:r>
+        <w:rPr>
+          <w:b/>
+          <w:bCs/>
+        </w:rPr>
+        <w:t>Fitness:</w:t>
+      </w:r>
+    </w:p>
+    <w:p>
+      <w:r>
+        <w:t xml:space="preserve">Before </w:t>
+      </w:r>
+      <w:r>
+        <w:t xml:space="preserve">continuing, </w:t>
+      </w:r>
+      <w:r>
+        <w:t xml:space="preserve">I would first like to set some clear definitions that will be important going forward. </w:t>
+      </w:r>
+      <w:r>
+        <w:t xml:space="preserve">Rather than using the common </w:t>
+      </w:r>
+      <w:r>
+        <w:t xml:space="preserve">phrase cost of resistance to describe </w:t>
+      </w:r>
+      <w:r>
+        <w:t xml:space="preserve">the effect a mutation has </w:t>
+      </w:r>
+      <w:r>
+        <w:t>I will be using the term fitness effects.</w:t>
+      </w:r>
+      <w:r>
+        <w:t xml:space="preserve"> This decision was inspired by </w:t>
+      </w:r>
+      <w:r>
+        <w:t>Lenormand et al. (2018)</w:t>
+      </w:r>
+      <w:r>
+        <w:t xml:space="preserve"> who argued in his paper that </w:t>
+      </w:r>
+      <w:r>
+        <w:t>we have been conflating these two concepts which has created misconceptions</w:t>
+      </w:r>
+      <w:r>
+        <w:t xml:space="preserve"> and impedes research efforts. </w:t>
+      </w:r>
+      <w:r>
+        <w:t xml:space="preserve">For this review I will </w:t>
+      </w:r>
+      <w:r>
+        <w:t xml:space="preserve">define fitness </w:t>
+      </w:r>
+      <w:r>
+        <w:t xml:space="preserve">effect as </w:t>
+      </w:r>
+      <w:r>
+        <w:t xml:space="preserve">the effect a </w:t>
+      </w:r>
+      <w:r>
+        <w:t>m</w:t>
+      </w:r>
+      <w:r>
+        <w:t>utation ha</w:t>
+      </w:r>
+      <w:r>
+        <w:t>s o</w:t>
+      </w:r>
+      <w:r>
+        <w:t xml:space="preserve">n an organism’s ability to survive in a given environment. </w:t>
+      </w:r>
+      <w:r>
+        <w:t>This definition</w:t>
+      </w:r>
+      <w:r>
+        <w:t xml:space="preserve"> </w:t>
+      </w:r>
+      <w:r>
+        <w:t xml:space="preserve">is </w:t>
+      </w:r>
+      <w:r>
+        <w:t xml:space="preserve">broad </w:t>
+      </w:r>
+      <w:r>
+        <w:t>and inclusive</w:t>
+      </w:r>
+      <w:r>
+        <w:t xml:space="preserve"> but most importantly </w:t>
+      </w:r>
+      <w:r>
+        <w:t xml:space="preserve">does not propose an assumption </w:t>
+      </w:r>
+      <w:r>
+        <w:t xml:space="preserve">of whether it is good or bad. </w:t>
+      </w:r>
+      <w:r>
+        <w:t xml:space="preserve">Conversely, cost of resistance is </w:t>
+      </w:r>
+      <w:r>
+        <w:t>defined as the price an organism pays</w:t>
+      </w:r>
+      <w:r>
+        <w:t xml:space="preserve"> to survive that is</w:t>
+      </w:r>
+      <w:r>
+        <w:t xml:space="preserve"> </w:t>
+      </w:r>
+      <w:r>
+        <w:t xml:space="preserve">usually in the reduction of fitness in an environment </w:t>
+      </w:r>
+      <w:r>
+        <w:t xml:space="preserve">due to </w:t>
+      </w:r>
+      <w:r>
+        <w:t>factors</w:t>
+      </w:r>
+      <w:r>
+        <w:t xml:space="preserve"> like </w:t>
+      </w:r>
+      <w:r>
+        <w:t>antibiotics, pesticides</w:t>
+      </w:r>
+      <w:r>
+        <w:t>, and</w:t>
+      </w:r>
+      <w:r>
+        <w:t xml:space="preserve"> toxins</w:t>
+      </w:r>
+      <w:r>
+        <w:t>.</w:t>
+      </w:r>
+      <w:r>
+        <w:t xml:space="preserve"> </w:t>
+      </w:r>
+      <w:r>
+        <w:t>With</w:t>
+      </w:r>
+      <w:r>
+        <w:t xml:space="preserve"> the definitions I have listed above</w:t>
+      </w:r>
+      <w:r>
+        <w:t xml:space="preserve"> in mind the</w:t>
+      </w:r>
+      <w:r>
+        <w:t xml:space="preserve"> </w:t>
+      </w:r>
+      <w:r>
+        <w:t>main issue</w:t>
+      </w:r>
+      <w:r>
+        <w:t xml:space="preserve"> we have with the term</w:t>
+      </w:r>
+      <w:r>
+        <w:t xml:space="preserve"> </w:t>
+      </w:r>
+      <w:r>
+        <w:t>cost of resistance</w:t>
+      </w:r>
+      <w:r>
+        <w:t xml:space="preserve"> is that it is too narrow </w:t>
+      </w:r>
+      <w:r>
+        <w:t>and that it is too much of an assumption</w:t>
+      </w:r>
+      <w:r>
+        <w:t xml:space="preserve"> often made too early. This is because </w:t>
+      </w:r>
+      <w:r>
+        <w:t xml:space="preserve">if we have already </w:t>
+      </w:r>
+      <w:proofErr w:type="spellStart"/>
+      <w:r>
+        <w:t>labled</w:t>
+      </w:r>
+      <w:proofErr w:type="spellEnd"/>
+      <w:r>
+        <w:t xml:space="preserve"> an effect as a “cost” we are already assuming </w:t>
+      </w:r>
+      <w:r>
+        <w:t xml:space="preserve">it is inherently negative </w:t>
+      </w:r>
+      <w:r>
+        <w:t xml:space="preserve">when in reality this “cost” that we think we see </w:t>
+      </w:r>
+      <w:r>
+        <w:t xml:space="preserve">in our specific </w:t>
+      </w:r>
+      <w:r>
+        <w:t>treated</w:t>
+      </w:r>
+      <w:r>
+        <w:t xml:space="preserve"> environment could be </w:t>
+      </w:r>
+      <w:r>
+        <w:t>neutral or even beneficial</w:t>
+      </w:r>
+      <w:r>
+        <w:t xml:space="preserve"> in another en</w:t>
+      </w:r>
+      <w:r>
+        <w:t>vironment</w:t>
+      </w:r>
+      <w:r>
+        <w:t xml:space="preserve">. </w:t>
+      </w:r>
+      <w:r>
+        <w:t xml:space="preserve">Because of this </w:t>
+      </w:r>
+      <w:r>
+        <w:t>fitness effect is a much more</w:t>
+      </w:r>
+      <w:r>
+        <w:t xml:space="preserve"> </w:t>
+      </w:r>
+      <w:r>
+        <w:t>appropriate</w:t>
+      </w:r>
+      <w:r>
+        <w:t xml:space="preserve"> and open minded term </w:t>
+      </w:r>
+      <w:r>
+        <w:t>as</w:t>
+      </w:r>
+      <w:r>
+        <w:t xml:space="preserve"> it simply takes what we see during </w:t>
+      </w:r>
+      <w:r>
+        <w:t>experiments</w:t>
+      </w:r>
+      <w:r>
+        <w:t xml:space="preserve"> as an effect a</w:t>
+      </w:r>
+      <w:r>
+        <w:t xml:space="preserve">nd analyses the effect as it is and does not make any assumptions as to whether the effect is good or bad. </w:t>
+      </w:r>
+    </w:p>
+    <w:p>
+      <w:pPr>
+        <w:rPr>
+          <w:b/>
+          <w:bCs/>
+        </w:rPr>
+      </w:pPr>
+    </w:p>
+    <w:p>
+      <w:pPr>
+        <w:rPr>
+          <w:b/>
+          <w:bCs/>
+        </w:rPr>
+      </w:pPr>
+      <w:r>
+        <w:rPr>
+          <w:b/>
+          <w:bCs/>
+        </w:rPr>
+        <w:t>Temperature</w:t>
+      </w:r>
+      <w:r>
+        <w:rPr>
+          <w:b/>
+          <w:bCs/>
+        </w:rPr>
+        <w:t>:</w:t>
+      </w:r>
+    </w:p>
+    <w:p>
+      <w:r>
+        <w:t>Intro</w:t>
+      </w:r>
+    </w:p>
+    <w:p>
+      <w:r>
         <w:lastRenderedPageBreak/>
-        <w:t>acids, previous studies done on Haemophilus influenzae, M. tuberculosis, Neisseria and Streptococcus pneumoniae indicate that resistance mutations only occur at a relatively small set of loci known as the rifampicin resistance-determining region (RRDR) (Goldstein, 2014).</w:t>
-      </w:r>
-      <w:r>
-        <w:t xml:space="preserve"> Through this relationship we have managed to evolve 28 unique E. coli strains each </w:t>
-      </w:r>
-      <w:proofErr w:type="spellStart"/>
-      <w:r>
-        <w:t>harboring</w:t>
-      </w:r>
-      <w:proofErr w:type="spellEnd"/>
-      <w:r>
-        <w:t xml:space="preserve"> a unique </w:t>
-      </w:r>
-      <w:proofErr w:type="spellStart"/>
-      <w:r>
-        <w:t>rpoB</w:t>
-      </w:r>
-      <w:proofErr w:type="spellEnd"/>
-      <w:r>
-        <w:t xml:space="preserve"> mutation. Going forward I will be using these mutations to test for fitness effects and the stochasticity. </w:t>
-      </w:r>
-    </w:p>
-    <w:p/>
-    <w:p>
-      <w:r>
-        <w:t xml:space="preserve">Chapter 1 Fitness </w:t>
-      </w:r>
-    </w:p>
-    <w:p>
-      <w:pPr>
-        <w:rPr>
-          <w:b/>
-          <w:bCs/>
-        </w:rPr>
-      </w:pPr>
-      <w:r>
-        <w:rPr>
-          <w:b/>
-          <w:bCs/>
-        </w:rPr>
-        <w:t>Fitness:</w:t>
-      </w:r>
-    </w:p>
-    <w:p>
-      <w:r>
-        <w:t xml:space="preserve">Before </w:t>
-      </w:r>
-      <w:r>
-        <w:t xml:space="preserve">continuing, </w:t>
-      </w:r>
-      <w:r>
-        <w:t xml:space="preserve">I would first like to set some clear definitions that will be important going forward. </w:t>
-      </w:r>
-      <w:r>
-        <w:t xml:space="preserve">Rather than using the common </w:t>
-      </w:r>
-      <w:r>
-        <w:t xml:space="preserve">phrase cost of resistance to describe </w:t>
-      </w:r>
-      <w:r>
-        <w:t xml:space="preserve">the effect a mutation has </w:t>
-      </w:r>
-      <w:r>
-        <w:t>I will be using the term fitness effects.</w:t>
-      </w:r>
-      <w:r>
-        <w:t xml:space="preserve"> This decision was inspired by </w:t>
-      </w:r>
-      <w:r>
-        <w:t>Lenormand et al. (2018)</w:t>
-      </w:r>
-      <w:r>
-        <w:t xml:space="preserve"> who argued in his paper that </w:t>
-      </w:r>
-      <w:r>
-        <w:t>we have been conflating these two concepts which has created misconceptions</w:t>
-      </w:r>
-      <w:r>
-        <w:t xml:space="preserve"> and impedes research efforts. </w:t>
-      </w:r>
-      <w:r>
-        <w:t xml:space="preserve">For this review I will </w:t>
-      </w:r>
-      <w:r>
-        <w:t xml:space="preserve">define fitness </w:t>
-      </w:r>
-      <w:r>
-        <w:t xml:space="preserve">effect as </w:t>
-      </w:r>
-      <w:r>
-        <w:t xml:space="preserve">the effect a </w:t>
-      </w:r>
-      <w:r>
-        <w:t>m</w:t>
-      </w:r>
-      <w:r>
-        <w:t>utation ha</w:t>
-      </w:r>
-      <w:r>
-        <w:t>s o</w:t>
-      </w:r>
-      <w:r>
-        <w:t xml:space="preserve">n an organism’s ability to survive in a given environment. </w:t>
-      </w:r>
-      <w:r>
-        <w:t>This definition</w:t>
+        <w:t xml:space="preserve">While there is a myriad of </w:t>
+      </w:r>
+      <w:r>
+        <w:t xml:space="preserve">environmental </w:t>
+      </w:r>
+      <w:r>
+        <w:t>stressors available to explore the fitness effect of bacteria</w:t>
       </w:r>
       <w:r>
         <w:t xml:space="preserve"> </w:t>
       </w:r>
       <w:r>
-        <w:t xml:space="preserve">is </w:t>
-      </w:r>
-      <w:r>
-        <w:t xml:space="preserve">broad </w:t>
-      </w:r>
-      <w:r>
-        <w:t>and inclusive</w:t>
-      </w:r>
-      <w:r>
-        <w:t xml:space="preserve"> but most importantly </w:t>
-      </w:r>
-      <w:r>
-        <w:t xml:space="preserve">does not propose an assumption </w:t>
-      </w:r>
-      <w:r>
-        <w:t xml:space="preserve">of whether it is good or bad. </w:t>
-      </w:r>
-      <w:r>
-        <w:t xml:space="preserve">Conversely, cost of resistance is </w:t>
-      </w:r>
-      <w:r>
-        <w:t>defined as the price an organism pays</w:t>
-      </w:r>
-      <w:r>
-        <w:t xml:space="preserve"> to survive that is</w:t>
+        <w:t xml:space="preserve">including but not limited to </w:t>
+      </w:r>
+      <w:r>
+        <w:t>pH, osmolarity, and salt concentration</w:t>
+      </w:r>
+      <w:r>
+        <w:t xml:space="preserve">, we selected temperature </w:t>
+      </w:r>
+      <w:r>
+        <w:t>as the primary stressor for this investigation</w:t>
+      </w:r>
+      <w:r>
+        <w:t>.</w:t>
       </w:r>
       <w:r>
         <w:t xml:space="preserve"> </w:t>
       </w:r>
       <w:r>
-        <w:t xml:space="preserve">usually in the reduction of fitness in an environment </w:t>
-      </w:r>
-      <w:r>
-        <w:t xml:space="preserve">due to </w:t>
-      </w:r>
-      <w:r>
-        <w:t>factors</w:t>
-      </w:r>
-      <w:r>
-        <w:t xml:space="preserve"> like </w:t>
-      </w:r>
-      <w:r>
-        <w:t>antibiotics, pesticides</w:t>
-      </w:r>
-      <w:r>
-        <w:t>, and</w:t>
-      </w:r>
-      <w:r>
-        <w:t xml:space="preserve"> toxins</w:t>
-      </w:r>
-      <w:r>
-        <w:t>.</w:t>
+        <w:t>T</w:t>
+      </w:r>
+      <w:r>
+        <w:t xml:space="preserve">emperature </w:t>
+      </w:r>
+      <w:r>
+        <w:t xml:space="preserve">is one of the most ancient and pervasive </w:t>
+      </w:r>
+      <w:r>
+        <w:t xml:space="preserve">selection pressure organisms on earth has encountered and it has been shaping bacterial physiology before many other stressors like </w:t>
+      </w:r>
+      <w:r>
+        <w:t>antibiotics</w:t>
+      </w:r>
+      <w:r>
+        <w:t xml:space="preserve"> which has been</w:t>
+      </w:r>
+      <w:r>
+        <w:t xml:space="preserve"> estimated to have first appeared between 2 billion and 40 million years ag</w:t>
+      </w:r>
+      <w:r>
+        <w:t>o</w:t>
+      </w:r>
+      <w:r>
+        <w:t xml:space="preserve"> (</w:t>
+      </w:r>
+      <w:r>
+        <w:t>)</w:t>
+      </w:r>
+      <w:r>
+        <w:t xml:space="preserve">. </w:t>
+      </w:r>
+      <w:r>
+        <w:t>Shifts in optimal temperature has far reaching implications for any organism and in bacteria it effects</w:t>
       </w:r>
       <w:r>
         <w:t xml:space="preserve"> </w:t>
       </w:r>
       <w:r>
-        <w:t>With</w:t>
-      </w:r>
-      <w:r>
-        <w:t xml:space="preserve"> the definitions I have listed above</w:t>
-      </w:r>
-      <w:r>
-        <w:t xml:space="preserve"> in mind the</w:t>
+        <w:t>genome-wide gene expression patterns, protein folding and stability, membrane composition</w:t>
+      </w:r>
+      <w:r>
+        <w:t xml:space="preserve"> ().</w:t>
+      </w:r>
+      <w:r>
+        <w:t xml:space="preserve"> Consequently, we find the stress which antibiotics imposes onto bacteria to be surprisingly similar to temperature</w:t>
+      </w:r>
+      <w:r>
+        <w:t xml:space="preserve">. </w:t>
+      </w:r>
+      <w:r>
+        <w:t xml:space="preserve">As </w:t>
+      </w:r>
+      <w:r>
+        <w:t>alluded</w:t>
+      </w:r>
+      <w:r>
+        <w:t xml:space="preserve"> to earlier</w:t>
+      </w:r>
+      <w:r>
+        <w:t>,</w:t>
+      </w:r>
+      <w:r>
+        <w:t xml:space="preserve"> temperature being a stressor that predates many others especially antibiotics </w:t>
+      </w:r>
+      <w:r>
+        <w:t xml:space="preserve">there has been hypothesis and some evidence that suggests there could have been co-opted resistance where processes that confer resistance to temperature can also assist with antibiotic stress (). An example of this is where both high temperature and some antibiotics like </w:t>
+      </w:r>
+      <w:r>
+        <w:t xml:space="preserve">macrolides and aminoglycoside </w:t>
+      </w:r>
+      <w:r>
+        <w:t xml:space="preserve">both alter </w:t>
+      </w:r>
+      <w:r>
+        <w:t xml:space="preserve">how protein is folded and synthesised (). </w:t>
+      </w:r>
+      <w:r>
+        <w:t xml:space="preserve">This also makes </w:t>
+      </w:r>
+      <w:r>
+        <w:t>sense</w:t>
+      </w:r>
+      <w:r>
+        <w:t xml:space="preserve"> from a</w:t>
+      </w:r>
+      <w:r>
+        <w:t>n</w:t>
+      </w:r>
+      <w:r>
+        <w:t xml:space="preserve"> evolutionary </w:t>
+      </w:r>
+      <w:r>
+        <w:t>perspective</w:t>
+      </w:r>
+      <w:r>
+        <w:t xml:space="preserve"> as </w:t>
+      </w:r>
+      <w:r>
+        <w:t xml:space="preserve">it is very costly to </w:t>
+      </w:r>
+      <w:r>
+        <w:t>develop independent stress responses</w:t>
+      </w:r>
+      <w:r>
+        <w:t xml:space="preserve"> which makes evolution </w:t>
+      </w:r>
+      <w:r>
+        <w:t>shared pathways to manage multiple stressors</w:t>
+      </w:r>
+      <w:r>
+        <w:t xml:space="preserve">. Due to </w:t>
+      </w:r>
+      <w:r>
+        <w:t xml:space="preserve">all of this </w:t>
+      </w:r>
+      <w:r>
+        <w:t xml:space="preserve">it </w:t>
+      </w:r>
+      <w:r>
+        <w:t>makes</w:t>
+      </w:r>
+      <w:r>
+        <w:t xml:space="preserve"> a compelling study </w:t>
+      </w:r>
+      <w:r>
+        <w:t xml:space="preserve">to conduct a </w:t>
+      </w:r>
+      <w:r>
+        <w:t>thorough</w:t>
+      </w:r>
+      <w:r>
+        <w:t xml:space="preserve"> investigation by looking at a wide temperature gradient while also switching the order of resistance by observing</w:t>
+      </w:r>
+      <w:r>
+        <w:t xml:space="preserve"> what happens when a bacterium that has already acquired </w:t>
+      </w:r>
+      <w:r>
+        <w:t xml:space="preserve">antibiotic </w:t>
+      </w:r>
+      <w:r>
+        <w:t xml:space="preserve">resistance mutations is then forced to </w:t>
+      </w:r>
+      <w:r>
+        <w:t>overcome</w:t>
+      </w:r>
+      <w:r>
+        <w:t xml:space="preserve"> thermal stress</w:t>
+      </w:r>
+      <w:r>
+        <w:t xml:space="preserve">. </w:t>
+      </w:r>
+    </w:p>
+    <w:p>
+      <w:r>
+        <w:t xml:space="preserve">Heat </w:t>
+      </w:r>
+      <w:r>
+        <w:t xml:space="preserve">response </w:t>
       </w:r>
       <w:r>
         <w:t xml:space="preserve"> </w:t>
       </w:r>
-      <w:r>
-        <w:t>main issue</w:t>
-      </w:r>
-      <w:r>
-        <w:t xml:space="preserve"> we have with the term</w:t>
+    </w:p>
+    <w:p>
+      <w:pPr>
+        <w:rPr>
+          <w:lang w:eastAsia="zh-CN"/>
+        </w:rPr>
+      </w:pPr>
+      <w:r>
+        <w:t>When temperature rises to a level above the</w:t>
+      </w:r>
+      <w:r>
+        <w:t xml:space="preserve"> optimal growth temperature, bacteria cells enter a state of heat shock which triggers its stress response</w:t>
+      </w:r>
+      <w:r>
+        <w:t xml:space="preserve">. </w:t>
       </w:r>
       <w:r>
         <w:t xml:space="preserve"> </w:t>
       </w:r>
       <w:r>
-        <w:t>cost of resistance</w:t>
-      </w:r>
-      <w:r>
-        <w:t xml:space="preserve"> is that it is too narrow </w:t>
-      </w:r>
-      <w:r>
-        <w:t>and that it is too much of an assumption</w:t>
-      </w:r>
-      <w:r>
-        <w:t xml:space="preserve"> often made too early. This is because </w:t>
-      </w:r>
-      <w:r>
-        <w:t xml:space="preserve">if we have already </w:t>
-      </w:r>
-      <w:proofErr w:type="spellStart"/>
-      <w:r>
-        <w:t>labled</w:t>
-      </w:r>
-      <w:proofErr w:type="spellEnd"/>
-      <w:r>
-        <w:t xml:space="preserve"> an effect as a “cost” we are already assuming </w:t>
-      </w:r>
-      <w:r>
-        <w:t xml:space="preserve">it is inherently negative </w:t>
-      </w:r>
-      <w:r>
-        <w:t xml:space="preserve">when in reality this “cost” that we think we see </w:t>
-      </w:r>
-      <w:r>
-        <w:t xml:space="preserve">in our specific </w:t>
-      </w:r>
-      <w:r>
-        <w:t>treated</w:t>
-      </w:r>
-      <w:r>
-        <w:t xml:space="preserve"> environment could be </w:t>
-      </w:r>
-      <w:r>
-        <w:t>neutral or even beneficial</w:t>
-      </w:r>
-      <w:r>
-        <w:t xml:space="preserve"> in another en</w:t>
-      </w:r>
-      <w:r>
-        <w:t>vironment</w:t>
+        <w:t xml:space="preserve">Detection initially occurs through the </w:t>
+      </w:r>
+      <w:r>
+        <w:t xml:space="preserve">sensory </w:t>
+      </w:r>
+      <w:r>
+        <w:t xml:space="preserve">nucleic </w:t>
+      </w:r>
+      <w:r>
+        <w:t>acid</w:t>
+      </w:r>
+      <w:r>
+        <w:t xml:space="preserve"> </w:t>
+      </w:r>
+      <w:r>
+        <w:t>and</w:t>
+      </w:r>
+      <w:r>
+        <w:t xml:space="preserve"> protein </w:t>
+      </w:r>
+      <w:r>
+        <w:t>biomolecules</w:t>
+      </w:r>
+      <w:r>
+        <w:t xml:space="preserve"> </w:t>
+      </w:r>
+      <w:r>
+        <w:t>(</w:t>
+      </w:r>
+      <w:proofErr w:type="spellStart"/>
+      <w:r>
+        <w:t>Roncarati</w:t>
+      </w:r>
+      <w:proofErr w:type="spellEnd"/>
+      <w:r>
+        <w:t xml:space="preserve"> and Scarlato, 2017</w:t>
+      </w:r>
+      <w:r>
+        <w:t xml:space="preserve">). </w:t>
+      </w:r>
+      <w:r>
+        <w:t xml:space="preserve">This is followed up by the </w:t>
+      </w:r>
+      <w:r>
+        <w:t>upregulation of molecular chaperones</w:t>
+      </w:r>
+      <w:r>
+        <w:t xml:space="preserve"> like the </w:t>
+      </w:r>
+      <w:proofErr w:type="spellStart"/>
+      <w:r>
+        <w:t>DnaK</w:t>
+      </w:r>
+      <w:proofErr w:type="spellEnd"/>
+      <w:r>
+        <w:t>/</w:t>
+      </w:r>
+      <w:proofErr w:type="spellStart"/>
+      <w:r>
+        <w:t>DnaJ</w:t>
+      </w:r>
+      <w:proofErr w:type="spellEnd"/>
+      <w:r>
+        <w:t xml:space="preserve"> and </w:t>
+      </w:r>
+      <w:proofErr w:type="spellStart"/>
+      <w:r>
+        <w:t>GroEL</w:t>
+      </w:r>
+      <w:proofErr w:type="spellEnd"/>
+      <w:r>
+        <w:t xml:space="preserve">/GroES which </w:t>
+      </w:r>
+      <w:r>
+        <w:t xml:space="preserve">attempts and tries to </w:t>
+      </w:r>
+      <w:r>
+        <w:t>reverse</w:t>
+      </w:r>
+      <w:r>
+        <w:t>s</w:t>
+      </w:r>
+      <w:r>
+        <w:t xml:space="preserve"> the aggregation of misfolded proteins</w:t>
+      </w:r>
+      <w:r>
+        <w:t xml:space="preserve">. In conjunction </w:t>
+      </w:r>
+      <w:r>
+        <w:t>proteases</w:t>
+      </w:r>
+      <w:r>
+        <w:t xml:space="preserve"> also becomes activated and </w:t>
+      </w:r>
+      <w:r>
+        <w:t>degrade</w:t>
+      </w:r>
+      <w:r>
+        <w:t>s</w:t>
+      </w:r>
+      <w:r>
+        <w:t xml:space="preserve"> </w:t>
+      </w:r>
+      <w:r>
+        <w:t xml:space="preserve">irreversibly </w:t>
+      </w:r>
+      <w:r>
+        <w:t>damaged</w:t>
+      </w:r>
+      <w:r>
+        <w:t xml:space="preserve"> cells into small peptides</w:t>
+      </w:r>
+      <w:r>
+        <w:t xml:space="preserve"> (</w:t>
+      </w:r>
+      <w:r>
+        <w:t>R</w:t>
+      </w:r>
+      <w:r>
+        <w:t>ichter et al., 2010)</w:t>
+      </w:r>
+      <w:r>
+        <w:t>).</w:t>
+      </w:r>
+      <w:r>
+        <w:t xml:space="preserve"> </w:t>
+      </w:r>
+      <w:r>
+        <w:t>Aside from the general response to heat discussed here</w:t>
+      </w:r>
+      <w:r>
+        <w:t xml:space="preserve">, </w:t>
+      </w:r>
+      <w:r>
+        <w:t xml:space="preserve">individual bacteria </w:t>
+      </w:r>
+      <w:r>
+        <w:t>often have their</w:t>
+      </w:r>
+      <w:r>
+        <w:t xml:space="preserve"> own </w:t>
+      </w:r>
+      <w:r>
+        <w:t>specialised</w:t>
+      </w:r>
+      <w:r>
+        <w:t xml:space="preserve"> response. Take</w:t>
+      </w:r>
+      <w:r>
+        <w:t xml:space="preserve"> E. coil</w:t>
+      </w:r>
+      <w:r>
+        <w:t xml:space="preserve"> as an example,</w:t>
+      </w:r>
+      <w:r>
+        <w:t xml:space="preserve"> as temperature increases the primary heat shock regulator </w:t>
+      </w:r>
+      <w:r>
+        <w:t xml:space="preserve">sigma factor </w:t>
+      </w:r>
+      <w:r>
+        <w:t>o</w:t>
+      </w:r>
+      <w:r>
+        <w:t>32</w:t>
+      </w:r>
+      <w:r>
+        <w:t xml:space="preserve"> </w:t>
+      </w:r>
+      <w:r>
+        <w:t>ac</w:t>
+      </w:r>
+      <w:r>
+        <w:rPr>
+          <w:lang w:eastAsia="zh-CN"/>
+        </w:rPr>
+        <w:t>cumulates</w:t>
+      </w:r>
+      <w:r>
+        <w:t xml:space="preserve"> and binds to the RNA polymerase which transcribes any of the downstream heat shock </w:t>
+      </w:r>
+      <w:r>
+        <w:t>heat shock genes</w:t>
       </w:r>
       <w:r>
         <w:t xml:space="preserve">. </w:t>
       </w:r>
       <w:r>
-        <w:t xml:space="preserve">Because of this </w:t>
-      </w:r>
-      <w:r>
-        <w:t>fitness effect is a much more</w:t>
+        <w:rPr>
+          <w:lang w:eastAsia="zh-CN"/>
+        </w:rPr>
+        <w:t xml:space="preserve">It has been observed </w:t>
+      </w:r>
+      <w:r>
+        <w:t xml:space="preserve">that E.coli’s resistance to </w:t>
+      </w:r>
+      <w:r>
+        <w:t xml:space="preserve">high temperature not only relies on the common stress response but it also calls upon a group of genes not traditionally used named the </w:t>
+      </w:r>
+      <w:r>
+        <w:t>thermotolerant genes</w:t>
+      </w:r>
+      <w:r>
+        <w:t xml:space="preserve"> by </w:t>
+      </w:r>
+      <w:r>
+        <w:t>Murata</w:t>
+      </w:r>
+      <w:r>
+        <w:t xml:space="preserve">. </w:t>
+      </w:r>
+      <w:r>
+        <w:t xml:space="preserve">These genes which encompasses </w:t>
+      </w:r>
+      <w:r>
+        <w:t>energy metabolism, outer membrane organisation, DNA double-strand break repair, tRNA modification, translational control, and cell division</w:t>
+      </w:r>
+      <w:r>
+        <w:t xml:space="preserve"> all work in </w:t>
+      </w:r>
+      <w:r>
+        <w:t>unison</w:t>
+      </w:r>
+      <w:r>
+        <w:t xml:space="preserve"> to provide E.coli with a robust tolerance against high temperature</w:t>
+      </w:r>
+      <w:r>
+        <w:t xml:space="preserve">. </w:t>
+      </w:r>
+    </w:p>
+    <w:p>
+      <w:r>
+        <w:lastRenderedPageBreak/>
+        <w:t xml:space="preserve">Cold response </w:t>
+      </w:r>
+    </w:p>
+    <w:p>
+      <w:r>
+        <w:t xml:space="preserve">Unsurprisingly similar to </w:t>
+      </w:r>
+      <w:r>
+        <w:t>the heat shock response</w:t>
+      </w:r>
+      <w:r>
+        <w:t>,</w:t>
       </w:r>
       <w:r>
         <w:t xml:space="preserve"> </w:t>
       </w:r>
       <w:r>
-        <w:t>appropriate</w:t>
-      </w:r>
-      <w:r>
-        <w:t xml:space="preserve"> and open minded term </w:t>
-      </w:r>
-      <w:r>
-        <w:t>as</w:t>
-      </w:r>
-      <w:r>
-        <w:t xml:space="preserve"> it simply takes what we see during </w:t>
-      </w:r>
-      <w:r>
-        <w:t>experiments</w:t>
-      </w:r>
-      <w:r>
-        <w:t xml:space="preserve"> as an effect a</w:t>
-      </w:r>
-      <w:r>
-        <w:t xml:space="preserve">nd analyses the effect as it is and does not make any assumptions as to whether the effect is good or bad. </w:t>
-      </w:r>
-    </w:p>
-    <w:p>
-      <w:pPr>
-        <w:rPr>
-          <w:b/>
-          <w:bCs/>
-        </w:rPr>
-      </w:pPr>
-    </w:p>
-    <w:p>
-      <w:pPr>
-        <w:rPr>
-          <w:b/>
-          <w:bCs/>
-        </w:rPr>
-      </w:pPr>
-      <w:r>
-        <w:rPr>
-          <w:b/>
-          <w:bCs/>
-        </w:rPr>
-        <w:t>Temperature</w:t>
-      </w:r>
-      <w:r>
-        <w:rPr>
-          <w:b/>
-          <w:bCs/>
-        </w:rPr>
-        <w:t>:</w:t>
-      </w:r>
-    </w:p>
-    <w:p>
-      <w:r>
-        <w:t>Intro</w:t>
-      </w:r>
-    </w:p>
-    <w:p>
-      <w:r>
-        <w:t xml:space="preserve">While there is a myriad of </w:t>
-      </w:r>
-      <w:r>
-        <w:t xml:space="preserve">environmental </w:t>
-      </w:r>
-      <w:r>
-        <w:t>stressors available to explore the fitness effect of bacteria</w:t>
+        <w:t>cold s</w:t>
+      </w:r>
+      <w:r>
+        <w:t>hock</w:t>
+      </w:r>
+      <w:r>
+        <w:t xml:space="preserve"> is also a powerful stressor for bacterial growth</w:t>
+      </w:r>
+      <w:r>
+        <w:t xml:space="preserve">. </w:t>
+      </w:r>
+      <w:r>
+        <w:t>Cold temperat</w:t>
+      </w:r>
+      <w:r>
+        <w:t xml:space="preserve">ure </w:t>
+      </w:r>
+      <w:r>
+        <w:t>primarily</w:t>
+      </w:r>
+      <w:r>
+        <w:t xml:space="preserve"> impairs the </w:t>
+      </w:r>
+      <w:r>
+        <w:t>ribosome and</w:t>
+      </w:r>
+      <w:r>
+        <w:t xml:space="preserve"> promoted the </w:t>
+      </w:r>
+      <w:r>
+        <w:t>over-stabiliz</w:t>
+      </w:r>
+      <w:r>
+        <w:t xml:space="preserve">ation of </w:t>
+      </w:r>
+      <w:r>
+        <w:t>secondary DNA and RNA structures</w:t>
       </w:r>
       <w:r>
         <w:t xml:space="preserve"> </w:t>
       </w:r>
       <w:r>
-        <w:t xml:space="preserve">including but not limited to </w:t>
-      </w:r>
-      <w:r>
-        <w:t>pH, osmolarity, and salt concentration</w:t>
-      </w:r>
-      <w:r>
-        <w:t xml:space="preserve">, we selected temperature </w:t>
-      </w:r>
-      <w:r>
-        <w:t>as the primary stressor for this investigation</w:t>
-      </w:r>
-      <w:r>
-        <w:t>.</w:t>
-      </w:r>
-      <w:r>
-        <w:t xml:space="preserve"> </w:t>
-      </w:r>
-      <w:r>
-        <w:t>T</w:t>
-      </w:r>
-      <w:r>
-        <w:t xml:space="preserve">emperature </w:t>
-      </w:r>
-      <w:r>
-        <w:t xml:space="preserve">is one of the most ancient and pervasive </w:t>
-      </w:r>
-      <w:r>
-        <w:t xml:space="preserve">selection pressure organisms on earth has encountered and it has been shaping bacterial physiology before many other stressors like </w:t>
-      </w:r>
-      <w:r>
-        <w:t>antibiotics</w:t>
-      </w:r>
-      <w:r>
-        <w:t xml:space="preserve"> which has been</w:t>
-      </w:r>
-      <w:r>
-        <w:t xml:space="preserve"> estimated to have first appeared between 2 billion and </w:t>
-      </w:r>
-      <w:r>
-        <w:lastRenderedPageBreak/>
-        <w:t>40 million years ag</w:t>
-      </w:r>
-      <w:r>
-        <w:t>o</w:t>
-      </w:r>
-      <w:r>
-        <w:t xml:space="preserve"> (</w:t>
-      </w:r>
-      <w:r>
-        <w:t>)</w:t>
+        <w:t>(</w:t>
+      </w:r>
+      <w:r>
+        <w:t xml:space="preserve">Barria et al., 2013; </w:t>
+      </w:r>
+      <w:proofErr w:type="spellStart"/>
+      <w:r>
+        <w:t>Phadtare</w:t>
+      </w:r>
+      <w:proofErr w:type="spellEnd"/>
+      <w:r>
+        <w:t xml:space="preserve"> and Inouye, 2008; Yamanaka, 1999)</w:t>
       </w:r>
       <w:r>
         <w:t xml:space="preserve">. </w:t>
       </w:r>
       <w:r>
-        <w:t>Shifts in optimal temperature has far reaching implications for any organism and in bacteria it effects</w:t>
-      </w:r>
-      <w:r>
-        <w:t xml:space="preserve"> </w:t>
-      </w:r>
-      <w:r>
-        <w:t>genome-wide gene expression patterns, protein folding and stability, membrane composition</w:t>
-      </w:r>
-      <w:r>
-        <w:t xml:space="preserve"> ().</w:t>
-      </w:r>
-      <w:r>
-        <w:t xml:space="preserve"> Consequently, we find the stress which antibiotics imposes onto bacteria to be surprisingly similar to temperature</w:t>
-      </w:r>
-      <w:r>
-        <w:t xml:space="preserve">. </w:t>
-      </w:r>
-      <w:r>
-        <w:t xml:space="preserve">As </w:t>
-      </w:r>
-      <w:r>
-        <w:t>alluded</w:t>
-      </w:r>
-      <w:r>
-        <w:t xml:space="preserve"> to earlier</w:t>
-      </w:r>
-      <w:r>
-        <w:t>,</w:t>
-      </w:r>
-      <w:r>
-        <w:t xml:space="preserve"> temperature being a stressor that predates many others especially antibiotics </w:t>
-      </w:r>
-      <w:r>
-        <w:t xml:space="preserve">there has been hypothesis and some evidence that suggests there could have been co-opted resistance where processes that confer resistance to temperature can also assist with antibiotic stress (). An example of this is where both high temperature and some antibiotics like </w:t>
-      </w:r>
-      <w:r>
-        <w:t xml:space="preserve">macrolides and aminoglycoside </w:t>
-      </w:r>
-      <w:r>
-        <w:t xml:space="preserve">both alter </w:t>
-      </w:r>
-      <w:r>
-        <w:t xml:space="preserve">how protein is folded and synthesised (). </w:t>
-      </w:r>
-      <w:r>
-        <w:t xml:space="preserve">This also makes </w:t>
-      </w:r>
-      <w:r>
-        <w:t>sense</w:t>
-      </w:r>
-      <w:r>
-        <w:t xml:space="preserve"> from a</w:t>
-      </w:r>
-      <w:r>
-        <w:t>n</w:t>
-      </w:r>
-      <w:r>
-        <w:t xml:space="preserve"> evolutionary </w:t>
-      </w:r>
-      <w:r>
-        <w:t>perspective</w:t>
-      </w:r>
-      <w:r>
-        <w:t xml:space="preserve"> as </w:t>
-      </w:r>
-      <w:r>
-        <w:t xml:space="preserve">it is very costly to </w:t>
-      </w:r>
-      <w:r>
-        <w:t>develop independent stress responses</w:t>
-      </w:r>
-      <w:r>
-        <w:t xml:space="preserve"> which makes evolution </w:t>
-      </w:r>
-      <w:r>
-        <w:t>shared pathways to manage multiple stressors</w:t>
-      </w:r>
-      <w:r>
-        <w:t xml:space="preserve">. Due to </w:t>
-      </w:r>
-      <w:r>
-        <w:t xml:space="preserve">all of this </w:t>
-      </w:r>
-      <w:r>
-        <w:t xml:space="preserve">it </w:t>
-      </w:r>
-      <w:r>
-        <w:t>makes</w:t>
-      </w:r>
-      <w:r>
-        <w:t xml:space="preserve"> a compelling study </w:t>
-      </w:r>
-      <w:r>
-        <w:t xml:space="preserve">to conduct a </w:t>
-      </w:r>
-      <w:r>
-        <w:t>thorough</w:t>
-      </w:r>
-      <w:r>
-        <w:t xml:space="preserve"> investigation by looking at a wide temperature gradient while also switching the order of resistance by observing</w:t>
-      </w:r>
-      <w:r>
-        <w:t xml:space="preserve"> what happens when a bacterium that has already acquired </w:t>
-      </w:r>
-      <w:r>
-        <w:t xml:space="preserve">antibiotic </w:t>
-      </w:r>
-      <w:r>
-        <w:t xml:space="preserve">resistance mutations is then forced to </w:t>
-      </w:r>
-      <w:r>
-        <w:t>overcome</w:t>
-      </w:r>
-      <w:r>
-        <w:t xml:space="preserve"> thermal stress</w:t>
-      </w:r>
-      <w:r>
-        <w:t xml:space="preserve">. </w:t>
-      </w:r>
-    </w:p>
-    <w:p>
-      <w:r>
-        <w:t xml:space="preserve">Heat </w:t>
-      </w:r>
-      <w:r>
-        <w:t xml:space="preserve">response </w:t>
-      </w:r>
-      <w:r>
-        <w:t xml:space="preserve"> </w:t>
-      </w:r>
-    </w:p>
-    <w:p>
-      <w:pPr>
-        <w:rPr>
-          <w:lang w:eastAsia="zh-CN"/>
-        </w:rPr>
-      </w:pPr>
-      <w:r>
-        <w:t>When temperature rises to a level above the</w:t>
-      </w:r>
-      <w:r>
-        <w:t xml:space="preserve"> optimal growth temperature, bacteria cells enter a state of heat shock which triggers its stress response</w:t>
-      </w:r>
-      <w:r>
-        <w:t xml:space="preserve">. </w:t>
-      </w:r>
-      <w:r>
-        <w:t xml:space="preserve"> </w:t>
-      </w:r>
-      <w:r>
-        <w:t xml:space="preserve">Detection initially occurs through the </w:t>
-      </w:r>
-      <w:r>
-        <w:t xml:space="preserve">sensory </w:t>
-      </w:r>
-      <w:r>
-        <w:t xml:space="preserve">nucleic </w:t>
-      </w:r>
-      <w:r>
-        <w:t>acid</w:t>
-      </w:r>
-      <w:r>
-        <w:t xml:space="preserve"> </w:t>
-      </w:r>
-      <w:r>
-        <w:t>and</w:t>
-      </w:r>
-      <w:r>
-        <w:t xml:space="preserve"> protein </w:t>
-      </w:r>
-      <w:r>
-        <w:t>biomolecules</w:t>
-      </w:r>
-      <w:r>
-        <w:t xml:space="preserve"> </w:t>
-      </w:r>
-      <w:r>
-        <w:t>(</w:t>
-      </w:r>
-      <w:proofErr w:type="spellStart"/>
-      <w:r>
-        <w:t>Roncarati</w:t>
-      </w:r>
-      <w:proofErr w:type="spellEnd"/>
-      <w:r>
-        <w:t xml:space="preserve"> and Scarlato, 2017</w:t>
-      </w:r>
-      <w:r>
-        <w:t xml:space="preserve">). </w:t>
-      </w:r>
-      <w:r>
-        <w:t xml:space="preserve">This is followed up by the </w:t>
-      </w:r>
-      <w:r>
-        <w:t>upregulation of molecular chaperones</w:t>
-      </w:r>
-      <w:r>
-        <w:t xml:space="preserve"> like the </w:t>
-      </w:r>
-      <w:proofErr w:type="spellStart"/>
-      <w:r>
-        <w:t>DnaK</w:t>
-      </w:r>
-      <w:proofErr w:type="spellEnd"/>
-      <w:r>
-        <w:t>/</w:t>
-      </w:r>
-      <w:proofErr w:type="spellStart"/>
-      <w:r>
-        <w:t>DnaJ</w:t>
-      </w:r>
-      <w:proofErr w:type="spellEnd"/>
-      <w:r>
-        <w:t xml:space="preserve"> and </w:t>
-      </w:r>
-      <w:proofErr w:type="spellStart"/>
-      <w:r>
-        <w:t>GroEL</w:t>
-      </w:r>
-      <w:proofErr w:type="spellEnd"/>
-      <w:r>
-        <w:t xml:space="preserve">/GroES which </w:t>
-      </w:r>
-      <w:r>
-        <w:t xml:space="preserve">attempts and tries to </w:t>
-      </w:r>
-      <w:r>
-        <w:t>reverse</w:t>
-      </w:r>
-      <w:r>
-        <w:t>s</w:t>
-      </w:r>
-      <w:r>
-        <w:t xml:space="preserve"> the aggregation of misfolded proteins</w:t>
-      </w:r>
-      <w:r>
-        <w:t xml:space="preserve">. In conjunction </w:t>
-      </w:r>
-      <w:r>
-        <w:t>proteases</w:t>
-      </w:r>
-      <w:r>
-        <w:t xml:space="preserve"> also becomes activated and </w:t>
-      </w:r>
-      <w:r>
-        <w:t>degrade</w:t>
-      </w:r>
-      <w:r>
-        <w:t>s</w:t>
-      </w:r>
-      <w:r>
-        <w:t xml:space="preserve"> </w:t>
-      </w:r>
-      <w:r>
-        <w:t xml:space="preserve">irreversibly </w:t>
-      </w:r>
-      <w:r>
-        <w:t>damaged</w:t>
-      </w:r>
-      <w:r>
-        <w:t xml:space="preserve"> cells into small peptides</w:t>
-      </w:r>
-      <w:r>
-        <w:t xml:space="preserve"> (</w:t>
-      </w:r>
-      <w:r>
-        <w:t>R</w:t>
-      </w:r>
-      <w:r>
-        <w:t>ichter et al., 2010)</w:t>
-      </w:r>
-      <w:r>
-        <w:t>).</w:t>
-      </w:r>
-      <w:r>
-        <w:t xml:space="preserve"> </w:t>
-      </w:r>
-      <w:r>
-        <w:t>Aside from the general response to heat discussed here</w:t>
-      </w:r>
-      <w:r>
-        <w:t xml:space="preserve">, </w:t>
-      </w:r>
-      <w:r>
-        <w:t xml:space="preserve">individual bacteria </w:t>
-      </w:r>
-      <w:r>
-        <w:t>often have their</w:t>
-      </w:r>
-      <w:r>
-        <w:t xml:space="preserve"> own </w:t>
-      </w:r>
-      <w:r>
-        <w:t>specialised</w:t>
-      </w:r>
-      <w:r>
-        <w:t xml:space="preserve"> response. Take</w:t>
-      </w:r>
-      <w:r>
-        <w:t xml:space="preserve"> E. coil</w:t>
-      </w:r>
-      <w:r>
-        <w:t xml:space="preserve"> as an example,</w:t>
-      </w:r>
-      <w:r>
-        <w:t xml:space="preserve"> as temperature increases the primary heat shock regulator </w:t>
-      </w:r>
-      <w:r>
-        <w:t xml:space="preserve">sigma factor </w:t>
-      </w:r>
-      <w:r>
-        <w:t>o</w:t>
-      </w:r>
-      <w:r>
-        <w:t>32</w:t>
-      </w:r>
-      <w:r>
-        <w:t xml:space="preserve"> </w:t>
-      </w:r>
-      <w:r>
-        <w:t>ac</w:t>
-      </w:r>
-      <w:r>
-        <w:rPr>
-          <w:lang w:eastAsia="zh-CN"/>
-        </w:rPr>
-        <w:t>cumulates</w:t>
-      </w:r>
-      <w:r>
-        <w:t xml:space="preserve"> and binds to the RNA polymerase which transcribes any of the downstream heat shock </w:t>
-      </w:r>
-      <w:r>
-        <w:t>heat shock genes</w:t>
-      </w:r>
-      <w:r>
-        <w:t xml:space="preserve">. </w:t>
-      </w:r>
-      <w:r>
-        <w:rPr>
-          <w:lang w:eastAsia="zh-CN"/>
-        </w:rPr>
-        <w:t xml:space="preserve">It has been observed </w:t>
-      </w:r>
-      <w:r>
-        <w:t xml:space="preserve">that E.coli’s resistance to </w:t>
-      </w:r>
-      <w:r>
-        <w:t xml:space="preserve">high temperature not only relies on the common stress response but it also calls upon a group of genes not traditionally used named the </w:t>
-      </w:r>
-      <w:r>
-        <w:t>thermotolerant genes</w:t>
-      </w:r>
-      <w:r>
-        <w:t xml:space="preserve"> by </w:t>
-      </w:r>
-      <w:r>
-        <w:t>Murata</w:t>
-      </w:r>
-      <w:r>
-        <w:t xml:space="preserve">. </w:t>
-      </w:r>
-      <w:r>
-        <w:t xml:space="preserve">These genes which encompasses </w:t>
-      </w:r>
-      <w:r>
-        <w:t>energy metabolism, outer membrane organisation, DNA double-strand break repair, tRNA modification, translational control, and cell division</w:t>
-      </w:r>
-      <w:r>
-        <w:t xml:space="preserve"> all work in </w:t>
-      </w:r>
-      <w:r>
-        <w:t>unison</w:t>
-      </w:r>
-      <w:r>
-        <w:t xml:space="preserve"> to provide E.coli with a robust tolerance against high temperature</w:t>
-      </w:r>
-      <w:r>
-        <w:t xml:space="preserve">. </w:t>
-      </w:r>
-    </w:p>
-    <w:p>
-      <w:r>
-        <w:t xml:space="preserve">Cold response </w:t>
-      </w:r>
-    </w:p>
-    <w:p>
-      <w:r>
-        <w:t xml:space="preserve">Unsurprisingly similar to </w:t>
-      </w:r>
-      <w:r>
-        <w:t>the heat shock response</w:t>
-      </w:r>
-      <w:r>
-        <w:t>,</w:t>
-      </w:r>
-      <w:r>
-        <w:t xml:space="preserve"> </w:t>
-      </w:r>
-      <w:r>
-        <w:t>cold s</w:t>
-      </w:r>
-      <w:r>
-        <w:t>hock</w:t>
-      </w:r>
-      <w:r>
-        <w:t xml:space="preserve"> is also a powerful stressor for bacterial growth</w:t>
-      </w:r>
-      <w:r>
-        <w:t xml:space="preserve">. </w:t>
-      </w:r>
-      <w:r>
-        <w:t>Cold temperat</w:t>
-      </w:r>
-      <w:r>
-        <w:t xml:space="preserve">ure </w:t>
-      </w:r>
-      <w:r>
-        <w:t>primarily</w:t>
-      </w:r>
-      <w:r>
-        <w:t xml:space="preserve"> impairs the </w:t>
-      </w:r>
-      <w:r>
-        <w:t>ribosome and</w:t>
-      </w:r>
-      <w:r>
-        <w:t xml:space="preserve"> promoted the </w:t>
-      </w:r>
-      <w:r>
-        <w:t>over-stabiliz</w:t>
-      </w:r>
-      <w:r>
-        <w:t xml:space="preserve">ation of </w:t>
-      </w:r>
-      <w:r>
-        <w:t>secondary DNA and RNA structures</w:t>
-      </w:r>
-      <w:r>
-        <w:t xml:space="preserve"> </w:t>
-      </w:r>
-      <w:r>
-        <w:t>(</w:t>
-      </w:r>
-      <w:r>
-        <w:t xml:space="preserve">Barria et al., 2013; </w:t>
-      </w:r>
-      <w:proofErr w:type="spellStart"/>
-      <w:r>
-        <w:t>Phadtare</w:t>
-      </w:r>
-      <w:proofErr w:type="spellEnd"/>
-      <w:r>
-        <w:t xml:space="preserve"> and Inouye, 2008; Yamanaka, 1999)</w:t>
-      </w:r>
-      <w:r>
-        <w:t xml:space="preserve">. </w:t>
-      </w:r>
-      <w:r>
         <w:t>In the case for E.coli under</w:t>
       </w:r>
       <w:r>
-        <w:t xml:space="preserve"> cold </w:t>
-      </w:r>
-      <w:r>
-        <w:lastRenderedPageBreak/>
-        <w:t xml:space="preserve">shock, bacterial growth </w:t>
+        <w:t xml:space="preserve"> cold shock, bacterial growth </w:t>
       </w:r>
       <w:r>
         <w:t xml:space="preserve">stops </w:t>
@@ -1470,6 +1480,7 @@
         <w:spacing w:after="80" w:line="300" w:lineRule="auto"/>
       </w:pPr>
       <w:r>
+        <w:lastRenderedPageBreak/>
         <w:t xml:space="preserve">Theory says </w:t>
       </w:r>
     </w:p>
@@ -1492,19 +1503,198 @@
     <w:p>
       <w:pPr>
         <w:spacing w:after="80" w:line="300" w:lineRule="auto"/>
+        <w:rPr>
+          <w:b/>
+          <w:bCs/>
+        </w:rPr>
       </w:pPr>
     </w:p>
     <w:p>
       <w:pPr>
         <w:spacing w:after="80" w:line="300" w:lineRule="auto"/>
-      </w:pPr>
+        <w:rPr>
+          <w:b/>
+          <w:bCs/>
+        </w:rPr>
+      </w:pPr>
+      <w:r>
+        <w:rPr>
+          <w:b/>
+          <w:bCs/>
+        </w:rPr>
+        <w:t xml:space="preserve">our results show that our mutations mostly grow the same as </w:t>
+      </w:r>
+      <w:r>
+        <w:rPr>
+          <w:b/>
+          <w:bCs/>
+        </w:rPr>
+        <w:t>WT</w:t>
+      </w:r>
     </w:p>
     <w:p>
       <w:pPr>
         <w:spacing w:after="80" w:line="300" w:lineRule="auto"/>
-      </w:pPr>
-      <w:r>
-        <w:lastRenderedPageBreak/>
+        <w:rPr>
+          <w:b/>
+          <w:bCs/>
+        </w:rPr>
+      </w:pPr>
+      <w:proofErr w:type="spellStart"/>
+      <w:r>
+        <w:rPr>
+          <w:b/>
+          <w:bCs/>
+        </w:rPr>
+        <w:t>rpoB</w:t>
+      </w:r>
+      <w:proofErr w:type="spellEnd"/>
+      <w:r>
+        <w:rPr>
+          <w:b/>
+          <w:bCs/>
+        </w:rPr>
+        <w:t xml:space="preserve"> does not provide benefit because WT grew just as well without it??</w:t>
+      </w:r>
+    </w:p>
+    <w:p>
+      <w:pPr>
+        <w:spacing w:after="80" w:line="300" w:lineRule="auto"/>
+        <w:rPr>
+          <w:b/>
+          <w:bCs/>
+        </w:rPr>
+      </w:pPr>
+      <w:r>
+        <w:rPr>
+          <w:b/>
+          <w:bCs/>
+        </w:rPr>
+        <w:t xml:space="preserve">Other side is that </w:t>
+      </w:r>
+      <w:r>
+        <w:rPr>
+          <w:b/>
+          <w:bCs/>
+        </w:rPr>
+        <w:t xml:space="preserve">we expect that </w:t>
+      </w:r>
+      <w:proofErr w:type="spellStart"/>
+      <w:r>
+        <w:rPr>
+          <w:b/>
+          <w:bCs/>
+        </w:rPr>
+        <w:t>rpoB</w:t>
+      </w:r>
+      <w:proofErr w:type="spellEnd"/>
+      <w:r>
+        <w:rPr>
+          <w:b/>
+          <w:bCs/>
+        </w:rPr>
+        <w:t xml:space="preserve"> mutations will be deleterious at a stressful temperature without RIF, but it seems to be fine </w:t>
+      </w:r>
+    </w:p>
+    <w:p>
+      <w:pPr>
+        <w:spacing w:after="80" w:line="300" w:lineRule="auto"/>
+        <w:rPr>
+          <w:b/>
+          <w:bCs/>
+        </w:rPr>
+      </w:pPr>
+      <w:r>
+        <w:rPr>
+          <w:b/>
+          <w:bCs/>
+        </w:rPr>
+        <w:t xml:space="preserve">So while it does not provide extra benefit it seems to not be a burden on the bacteria </w:t>
+      </w:r>
+    </w:p>
+    <w:p>
+      <w:pPr>
+        <w:spacing w:after="80" w:line="300" w:lineRule="auto"/>
+        <w:rPr>
+          <w:b/>
+          <w:bCs/>
+        </w:rPr>
+      </w:pPr>
+      <w:r>
+        <w:rPr>
+          <w:b/>
+          <w:bCs/>
+        </w:rPr>
+        <w:t xml:space="preserve">Seems like </w:t>
+      </w:r>
+      <w:proofErr w:type="spellStart"/>
+      <w:r>
+        <w:rPr>
+          <w:b/>
+          <w:bCs/>
+        </w:rPr>
+        <w:t>rpoB</w:t>
+      </w:r>
+      <w:proofErr w:type="spellEnd"/>
+      <w:r>
+        <w:rPr>
+          <w:b/>
+          <w:bCs/>
+        </w:rPr>
+        <w:t xml:space="preserve"> mutations are neither beneficial or deleterious </w:t>
+      </w:r>
+      <w:r>
+        <w:rPr>
+          <w:b/>
+          <w:bCs/>
+        </w:rPr>
+        <w:t xml:space="preserve">which in itself is interesting </w:t>
+      </w:r>
+    </w:p>
+    <w:p>
+      <w:pPr>
+        <w:spacing w:after="80" w:line="300" w:lineRule="auto"/>
+        <w:rPr>
+          <w:b/>
+          <w:bCs/>
+        </w:rPr>
+      </w:pPr>
+      <w:r>
+        <w:rPr>
+          <w:b/>
+          <w:bCs/>
+        </w:rPr>
+        <w:t xml:space="preserve">Some </w:t>
+      </w:r>
+      <w:r>
+        <w:rPr>
+          <w:b/>
+          <w:bCs/>
+        </w:rPr>
+        <w:t xml:space="preserve">nuance </w:t>
+      </w:r>
+      <w:r>
+        <w:rPr>
+          <w:b/>
+          <w:bCs/>
+        </w:rPr>
+        <w:t>like M12</w:t>
+      </w:r>
+    </w:p>
+    <w:p>
+      <w:pPr>
+        <w:spacing w:after="80" w:line="300" w:lineRule="auto"/>
+        <w:rPr>
+          <w:b/>
+          <w:bCs/>
+        </w:rPr>
+      </w:pPr>
+    </w:p>
+    <w:p>
+      <w:pPr>
+        <w:spacing w:after="80" w:line="300" w:lineRule="auto"/>
+      </w:pPr>
+      <w:r>
         <w:t xml:space="preserve">Having </w:t>
       </w:r>
       <w:r>
@@ -1598,10 +1788,7 @@
         <w:t xml:space="preserve">for </w:t>
       </w:r>
       <w:r>
-        <w:t>rifampicin</w:t>
-      </w:r>
-      <w:r>
-        <w:t xml:space="preserve"> resistance in multiple independent populations</w:t>
+        <w:t>rifampicin resistance in multiple independent populations</w:t>
       </w:r>
       <w:r>
         <w:t>. This is a substantial discovery as it provides support to the theory that heat resistance and antibiotic resistance has and can develop in unison. More importantly it shows</w:t>
@@ -1844,7 +2031,11 @@
         <w:t>through a two-phase evolution</w:t>
       </w:r>
       <w:r>
-        <w:t xml:space="preserve"> experiment that genetic background also in determining the fitness effects of E. coli with </w:t>
+        <w:t xml:space="preserve"> </w:t>
+      </w:r>
+      <w:r>
+        <w:lastRenderedPageBreak/>
+        <w:t xml:space="preserve">experiment that genetic background also in determining the fitness effects of E. coli with </w:t>
       </w:r>
       <w:proofErr w:type="spellStart"/>
       <w:r>
@@ -2020,7 +2211,6 @@
     </w:p>
     <w:p>
       <w:r>
-        <w:lastRenderedPageBreak/>
         <w:t xml:space="preserve">For a more robust analysis I will also be examining how the fitness effects of </w:t>
       </w:r>
       <w:proofErr w:type="spellStart"/>
@@ -2106,7 +2296,11 @@
         <w:t>Pseudomonas</w:t>
       </w:r>
       <w:r>
-        <w:t xml:space="preserve"> species validate and extend the patterns observed in </w:t>
+        <w:t xml:space="preserve"> species validate and extend the </w:t>
+      </w:r>
+      <w:r>
+        <w:lastRenderedPageBreak/>
+        <w:t xml:space="preserve">patterns observed in </w:t>
       </w:r>
       <w:r>
         <w:rPr>
@@ -2215,6 +2409,313 @@
       </w:r>
     </w:p>
     <w:p>
+      <w:pPr>
+        <w:rPr>
+          <w:b/>
+          <w:bCs/>
+        </w:rPr>
+      </w:pPr>
+      <w:r>
+        <w:rPr>
+          <w:b/>
+          <w:bCs/>
+        </w:rPr>
+        <w:t xml:space="preserve">Relationship between selection, establishment and </w:t>
+      </w:r>
+      <w:r>
+        <w:rPr>
+          <w:b/>
+          <w:bCs/>
+        </w:rPr>
+        <w:t>mutation rate</w:t>
+      </w:r>
+    </w:p>
+    <w:p>
+      <w:pPr>
+        <w:rPr>
+          <w:b/>
+          <w:bCs/>
+        </w:rPr>
+      </w:pPr>
+      <w:r>
+        <w:rPr>
+          <w:b/>
+          <w:bCs/>
+        </w:rPr>
+        <w:t xml:space="preserve">This system is stochastic but we have an uneven distribution </w:t>
+      </w:r>
+      <w:r>
+        <w:rPr>
+          <w:b/>
+          <w:bCs/>
+        </w:rPr>
+        <w:t xml:space="preserve">some </w:t>
+      </w:r>
+      <w:proofErr w:type="spellStart"/>
+      <w:r>
+        <w:rPr>
+          <w:b/>
+          <w:bCs/>
+        </w:rPr>
+        <w:t>rpoB</w:t>
+      </w:r>
+      <w:proofErr w:type="spellEnd"/>
+      <w:r>
+        <w:rPr>
+          <w:b/>
+          <w:bCs/>
+        </w:rPr>
+        <w:t xml:space="preserve"> mutations </w:t>
+      </w:r>
+      <w:r>
+        <w:rPr>
+          <w:b/>
+          <w:bCs/>
+        </w:rPr>
+        <w:t>t</w:t>
+      </w:r>
+      <w:r>
+        <w:rPr>
+          <w:b/>
+          <w:bCs/>
+        </w:rPr>
+        <w:t xml:space="preserve">hat we see more of has more ways to </w:t>
+      </w:r>
+      <w:r>
+        <w:rPr>
+          <w:b/>
+          <w:bCs/>
+        </w:rPr>
+        <w:t xml:space="preserve">select and establish than </w:t>
+      </w:r>
+      <w:r>
+        <w:rPr>
+          <w:b/>
+          <w:bCs/>
+        </w:rPr>
+        <w:t xml:space="preserve"> </w:t>
+      </w:r>
+      <w:r>
+        <w:rPr>
+          <w:b/>
+          <w:bCs/>
+        </w:rPr>
+        <w:t>others more rare ones</w:t>
+      </w:r>
+      <w:r>
+        <w:rPr>
+          <w:b/>
+          <w:bCs/>
+        </w:rPr>
+        <w:t>.</w:t>
+      </w:r>
+    </w:p>
+    <w:p>
+      <w:pPr>
+        <w:rPr>
+          <w:b/>
+          <w:bCs/>
+        </w:rPr>
+      </w:pPr>
+      <w:r>
+        <w:rPr>
+          <w:b/>
+          <w:bCs/>
+        </w:rPr>
+        <w:t xml:space="preserve">Why? </w:t>
+      </w:r>
+      <w:r>
+        <w:rPr>
+          <w:b/>
+          <w:bCs/>
+        </w:rPr>
+        <w:t xml:space="preserve">I want to find out the reason or this uneven distribution </w:t>
+      </w:r>
+    </w:p>
+    <w:p>
+      <w:pPr>
+        <w:rPr>
+          <w:b/>
+          <w:bCs/>
+        </w:rPr>
+      </w:pPr>
+    </w:p>
+    <w:p>
+      <w:pPr>
+        <w:numPr>
+          <w:ilvl w:val="0"/>
+          <w:numId w:val="8"/>
+        </w:numPr>
+        <w:rPr>
+          <w:b/>
+          <w:bCs/>
+          <w:lang w:val="en-US"/>
+        </w:rPr>
+      </w:pPr>
+      <w:r>
+        <w:rPr>
+          <w:b/>
+          <w:bCs/>
+          <w:lang w:val="en-US"/>
+        </w:rPr>
+        <w:t>Luck (stochastic)</w:t>
+      </w:r>
+    </w:p>
+    <w:p>
+      <w:pPr>
+        <w:numPr>
+          <w:ilvl w:val="0"/>
+          <w:numId w:val="8"/>
+        </w:numPr>
+        <w:rPr>
+          <w:b/>
+          <w:bCs/>
+          <w:lang w:val="en-US"/>
+        </w:rPr>
+      </w:pPr>
+      <w:r>
+        <w:rPr>
+          <w:b/>
+          <w:bCs/>
+          <w:lang w:val="en-US"/>
+        </w:rPr>
+        <w:t xml:space="preserve">Inoculum size </w:t>
+      </w:r>
+    </w:p>
+    <w:p>
+      <w:pPr>
+        <w:numPr>
+          <w:ilvl w:val="0"/>
+          <w:numId w:val="8"/>
+        </w:numPr>
+        <w:rPr>
+          <w:b/>
+          <w:bCs/>
+        </w:rPr>
+      </w:pPr>
+      <w:r>
+        <w:rPr>
+          <w:b/>
+          <w:bCs/>
+        </w:rPr>
+        <w:t xml:space="preserve">high mutational accessibility </w:t>
+      </w:r>
+    </w:p>
+    <w:p>
+      <w:pPr>
+        <w:numPr>
+          <w:ilvl w:val="0"/>
+          <w:numId w:val="8"/>
+        </w:numPr>
+        <w:rPr>
+          <w:b/>
+          <w:bCs/>
+        </w:rPr>
+      </w:pPr>
+      <w:r>
+        <w:rPr>
+          <w:b/>
+          <w:bCs/>
+        </w:rPr>
+        <w:t>low or compensable fitness cost</w:t>
+      </w:r>
+    </w:p>
+    <w:p>
+      <w:pPr>
+        <w:rPr>
+          <w:b/>
+          <w:bCs/>
+        </w:rPr>
+      </w:pPr>
+    </w:p>
+    <w:p>
+      <w:pPr>
+        <w:rPr>
+          <w:b/>
+          <w:bCs/>
+        </w:rPr>
+      </w:pPr>
+    </w:p>
+    <w:p>
+      <w:pPr>
+        <w:rPr>
+          <w:b/>
+          <w:bCs/>
+        </w:rPr>
+      </w:pPr>
+    </w:p>
+    <w:p>
+      <w:pPr>
+        <w:rPr>
+          <w:b/>
+          <w:bCs/>
+        </w:rPr>
+      </w:pPr>
+      <w:r>
+        <w:rPr>
+          <w:b/>
+          <w:bCs/>
+        </w:rPr>
+        <w:t>mutation rate</w:t>
+      </w:r>
+      <w:r>
+        <w:rPr>
+          <w:b/>
+          <w:bCs/>
+        </w:rPr>
+        <w:t xml:space="preserve"> (Input):</w:t>
+      </w:r>
+      <w:r>
+        <w:t xml:space="preserve"> This is the speed at which random, spontaneous changes occur in an organism's DNA. It is the raw, unintentional generator of genetic variation.</w:t>
+      </w:r>
+    </w:p>
+    <w:p>
+      <w:r>
+        <w:rPr>
+          <w:b/>
+          <w:bCs/>
+        </w:rPr>
+        <w:lastRenderedPageBreak/>
+        <w:t xml:space="preserve">Selection </w:t>
+      </w:r>
+      <w:r>
+        <w:rPr>
+          <w:b/>
+          <w:bCs/>
+        </w:rPr>
+        <w:t>(Filtering):</w:t>
+      </w:r>
+      <w:r>
+        <w:t xml:space="preserve"> This is the process where environmental pressures determine which mutations are passed on, </w:t>
+      </w:r>
+      <w:r>
+        <w:t>favouring</w:t>
+      </w:r>
+      <w:r>
+        <w:t xml:space="preserve"> beneficial mutations and removing harmful ones.</w:t>
+      </w:r>
+    </w:p>
+    <w:p>
+      <w:r>
+        <w:rPr>
+          <w:b/>
+          <w:bCs/>
+        </w:rPr>
+        <w:t xml:space="preserve">Establishment: </w:t>
+      </w:r>
+      <w:r>
+        <w:t>The process where a new mutation survives the initial, highly stochastic phase of low frequency and becomes common enough in the population to be shielded from elimination by random genetic drift</w:t>
+      </w:r>
+    </w:p>
+    <w:p>
+      <w:pPr>
+        <w:rPr>
+          <w:b/>
+          <w:bCs/>
+        </w:rPr>
+      </w:pPr>
+    </w:p>
+    <w:p>
       <w:r>
         <w:t xml:space="preserve">From both clinical and laboratory data we can see that certain </w:t>
       </w:r>
@@ -2445,6 +2946,7 @@
     </w:p>
     <w:p>
       <w:r>
+        <w:lastRenderedPageBreak/>
         <w:t>Trying to avoid evolution as we have found it can be very unpredictable</w:t>
       </w:r>
     </w:p>
@@ -2480,7 +2982,6 @@
     </w:p>
     <w:p>
       <w:r>
-        <w:lastRenderedPageBreak/>
         <w:t xml:space="preserve">we saw growth in 48c ONC but no growth in 48 experiment which means the cumulative stress of the </w:t>
       </w:r>
       <w:proofErr w:type="spellStart"/>
@@ -3059,6 +3560,7 @@
     </w:p>
     <w:p>
       <w:r>
+        <w:lastRenderedPageBreak/>
         <w:t xml:space="preserve">this paper suggests the specific </w:t>
       </w:r>
       <w:proofErr w:type="spellStart"/>
@@ -3100,112 +3602,115 @@
     </w:p>
     <w:p>
       <w:r>
+        <w:t xml:space="preserve">A decline in </w:t>
+      </w:r>
+      <w:proofErr w:type="spellStart"/>
+      <w:r>
+        <w:t>rpoBWT</w:t>
+      </w:r>
+      <w:proofErr w:type="spellEnd"/>
+      <w:r>
+        <w:t xml:space="preserve"> viable cell counts beyond the 150-min time point at 46°C (Figure 2B) indicated significant impairments in cellular processes. However, while the </w:t>
+      </w:r>
+      <w:proofErr w:type="spellStart"/>
+      <w:r>
+        <w:t>rpoBWT</w:t>
+      </w:r>
+      <w:proofErr w:type="spellEnd"/>
+      <w:r>
+        <w:t xml:space="preserve"> culture's CFU declined, the OD continued to rise during the same period. We considered that the arrest of cell division, resulting in filamentation, could cause OD to rise without actually increasing CFU. Indeed, growth of E. coli cultures at high temperature (≥ 45°C) has been reported to cause cell filamentation (Hoffman and Frank 1963; van </w:t>
+      </w:r>
+      <w:proofErr w:type="spellStart"/>
+      <w:r>
+        <w:t>Derlinden</w:t>
+      </w:r>
+      <w:proofErr w:type="spellEnd"/>
+      <w:r>
+        <w:t xml:space="preserve"> et al. 2008). We employed scanning electron microscopy to capture finer morphological details (Figure 3). At 37°C, </w:t>
+      </w:r>
+      <w:proofErr w:type="spellStart"/>
+      <w:r>
+        <w:t>rpoBWT</w:t>
+      </w:r>
+      <w:proofErr w:type="spellEnd"/>
+      <w:r>
+        <w:t xml:space="preserve"> and mutant cells from stationary phase culture have almost identical dimensions, appearing as short, ovoidal rods. However, at 46°C, cell length increased dramatically for both strains, with </w:t>
+      </w:r>
+      <w:proofErr w:type="spellStart"/>
+      <w:r>
+        <w:t>rpoBWT</w:t>
+      </w:r>
+      <w:proofErr w:type="spellEnd"/>
+      <w:r>
+        <w:t xml:space="preserve"> cells appearing much larger than mutant cells and more frequently lacking visible septa. These results demonstrate that in comparison to rpoB58 mutant cells, </w:t>
+      </w:r>
+      <w:proofErr w:type="spellStart"/>
+      <w:r>
+        <w:t>rpoBWT</w:t>
+      </w:r>
+      <w:proofErr w:type="spellEnd"/>
+      <w:r>
+        <w:t xml:space="preserve"> cells at 46°C are under considerably greater stress and frequently stop dividing.</w:t>
+      </w:r>
+      <w:r>
+        <w:tab/>
+      </w:r>
+    </w:p>
+    <w:p>
+      <w:r>
+        <w:t>Growth of E. coli strains incubated at 44°C in minimal medium is restricted principally due to the inactivation of the first enzyme (</w:t>
+      </w:r>
+      <w:proofErr w:type="spellStart"/>
+      <w:r>
+        <w:t>MetA</w:t>
+      </w:r>
+      <w:proofErr w:type="spellEnd"/>
+      <w:r>
+        <w:t xml:space="preserve">) of methionine biosynthesis (Ron and Davis 1971). However, what restricts high-temperature growth of E. coli in rich medium is not clear. The maximum growth temperature of E. coli incubated in rich medium is reported to be between 44.5°C and 46°C (Hoffman and Frank 1963; van </w:t>
+      </w:r>
+      <w:proofErr w:type="spellStart"/>
+      <w:r>
+        <w:t>Derlinden</w:t>
+      </w:r>
+      <w:proofErr w:type="spellEnd"/>
+      <w:r>
+        <w:t xml:space="preserve"> et al. 2008; Rudolph et al. 2010). For the E. coli strain background (MC4100) used in this study, the maximum growth temperature in a rich medium was determined to be between 45°C and 46°C. The presence of a mutant rpoB58 allele increased this limit to between 47°C and 48°C. The inhibition of E. coli growth at temperatures higher than 46°C is likely due to debilitating effects on cell structure–function, with a collapse in protein homeostasis being one of the major factors. Indeed, null mutations in genes central to the maintenance of protein homeostasis, such as those coding for molecular chaperones and proteases, significantly lower the maximum growth temperature and are classically linked to growth defects at temperatures between 37°C and 42°C (Paek and Walker 1987; Strauch et al. 1989; Sell et al. 1990; </w:t>
+      </w:r>
+      <w:proofErr w:type="spellStart"/>
+      <w:r>
+        <w:t>Ueguchi</w:t>
+      </w:r>
+      <w:proofErr w:type="spellEnd"/>
+      <w:r>
+        <w:t xml:space="preserve"> et al. 1995).  At an extreme high temperature between 46°C and 47°C, null mutations in 51 E. coli genes were shown to become essential for survival (Murata et al. 2011). In addition to some of the obvious candidate genes, such as chaperone-coding </w:t>
+      </w:r>
+      <w:proofErr w:type="spellStart"/>
+      <w:r>
+        <w:t>dnaK</w:t>
+      </w:r>
+      <w:proofErr w:type="spellEnd"/>
+      <w:r>
+        <w:t xml:space="preserve"> and </w:t>
+      </w:r>
+      <w:proofErr w:type="spellStart"/>
+      <w:r>
+        <w:t>dnaJ</w:t>
+      </w:r>
+      <w:proofErr w:type="spellEnd"/>
+      <w:r>
+        <w:t xml:space="preserve"> and protease-coding </w:t>
+      </w:r>
+      <w:proofErr w:type="spellStart"/>
+      <w:r>
+        <w:t>degP</w:t>
+      </w:r>
+      <w:proofErr w:type="spellEnd"/>
+      <w:r>
+        <w:t xml:space="preserve">, the screen identified genes involved in diverse cellular functions, including outer membrane biogenesis, cell division, and energy metabolism (Murata et al. 2011). Due to their essential nature, none of the genes directly involved in protein synthesis were identified in the screen, but the authors noted reduced expression of 23 genes that participate in protein synthesis. Based on this observation, they concluded that </w:t>
+      </w:r>
+      <w:r>
         <w:lastRenderedPageBreak/>
-        <w:t xml:space="preserve">A decline in </w:t>
-      </w:r>
-      <w:proofErr w:type="spellStart"/>
-      <w:r>
-        <w:t>rpoBWT</w:t>
-      </w:r>
-      <w:proofErr w:type="spellEnd"/>
-      <w:r>
-        <w:t xml:space="preserve"> viable cell counts beyond the 150-min time point at 46°C (Figure 2B) indicated significant impairments in cellular processes. However, while the </w:t>
-      </w:r>
-      <w:proofErr w:type="spellStart"/>
-      <w:r>
-        <w:t>rpoBWT</w:t>
-      </w:r>
-      <w:proofErr w:type="spellEnd"/>
-      <w:r>
-        <w:t xml:space="preserve"> culture's CFU declined, the OD continued to rise during the same period. We considered that the arrest of cell division, resulting in filamentation, could cause OD to rise without actually increasing CFU. Indeed, growth of E. coli cultures at high temperature (≥ 45°C) has been reported to cause cell filamentation (Hoffman and Frank 1963; van </w:t>
-      </w:r>
-      <w:proofErr w:type="spellStart"/>
-      <w:r>
-        <w:t>Derlinden</w:t>
-      </w:r>
-      <w:proofErr w:type="spellEnd"/>
-      <w:r>
-        <w:t xml:space="preserve"> et al. 2008). We employed scanning electron microscopy to capture finer morphological details (Figure 3). At 37°C, </w:t>
-      </w:r>
-      <w:proofErr w:type="spellStart"/>
-      <w:r>
-        <w:t>rpoBWT</w:t>
-      </w:r>
-      <w:proofErr w:type="spellEnd"/>
-      <w:r>
-        <w:t xml:space="preserve"> and mutant cells from stationary phase culture have almost identical dimensions, appearing as short, ovoidal rods. However, at 46°C, cell length increased dramatically for both strains, with </w:t>
-      </w:r>
-      <w:proofErr w:type="spellStart"/>
-      <w:r>
-        <w:t>rpoBWT</w:t>
-      </w:r>
-      <w:proofErr w:type="spellEnd"/>
-      <w:r>
-        <w:t xml:space="preserve"> cells appearing much larger than mutant cells and more frequently lacking visible septa. These results demonstrate that in comparison to rpoB58 mutant cells, </w:t>
-      </w:r>
-      <w:proofErr w:type="spellStart"/>
-      <w:r>
-        <w:t>rpoBWT</w:t>
-      </w:r>
-      <w:proofErr w:type="spellEnd"/>
-      <w:r>
-        <w:t xml:space="preserve"> cells at 46°C are under considerably greater stress and frequently stop dividing.</w:t>
-      </w:r>
-      <w:r>
-        <w:tab/>
-      </w:r>
-    </w:p>
-    <w:p>
-      <w:r>
-        <w:t>Growth of E. coli strains incubated at 44°C in minimal medium is restricted principally due to the inactivation of the first enzyme (</w:t>
-      </w:r>
-      <w:proofErr w:type="spellStart"/>
-      <w:r>
-        <w:t>MetA</w:t>
-      </w:r>
-      <w:proofErr w:type="spellEnd"/>
-      <w:r>
-        <w:t xml:space="preserve">) of methionine biosynthesis (Ron and Davis 1971). However, what restricts high-temperature growth of E. coli in rich medium is not clear. The maximum growth temperature of E. coli incubated in rich medium is reported to be between 44.5°C and 46°C (Hoffman and Frank 1963; van </w:t>
-      </w:r>
-      <w:proofErr w:type="spellStart"/>
-      <w:r>
-        <w:t>Derlinden</w:t>
-      </w:r>
-      <w:proofErr w:type="spellEnd"/>
-      <w:r>
-        <w:t xml:space="preserve"> et al. 2008; Rudolph et al. 2010). For the E. coli strain background (MC4100) used in this study, the maximum growth temperature in a rich medium was determined to be between 45°C and 46°C. The presence of a mutant rpoB58 allele increased this limit to between 47°C and 48°C. The inhibition of E. coli growth at temperatures higher than 46°C is likely due to debilitating effects on cell structure–function, with a collapse in protein homeostasis being one of the major factors. Indeed, null mutations in genes central to the maintenance of protein homeostasis, such as those coding for molecular chaperones and proteases, significantly lower the maximum growth temperature and are classically linked to growth defects at temperatures between 37°C and 42°C (Paek and Walker 1987; Strauch et al. 1989; Sell et al. 1990; </w:t>
-      </w:r>
-      <w:proofErr w:type="spellStart"/>
-      <w:r>
-        <w:t>Ueguchi</w:t>
-      </w:r>
-      <w:proofErr w:type="spellEnd"/>
-      <w:r>
-        <w:t xml:space="preserve"> et al. 1995).  At an extreme high temperature between 46°C and 47°C, null mutations in 51 E. coli genes were shown to become essential for survival (Murata et al. 2011). In addition to some of the obvious candidate genes, such as chaperone-coding </w:t>
-      </w:r>
-      <w:proofErr w:type="spellStart"/>
-      <w:r>
-        <w:t>dnaK</w:t>
-      </w:r>
-      <w:proofErr w:type="spellEnd"/>
-      <w:r>
-        <w:t xml:space="preserve"> and </w:t>
-      </w:r>
-      <w:proofErr w:type="spellStart"/>
-      <w:r>
-        <w:t>dnaJ</w:t>
-      </w:r>
-      <w:proofErr w:type="spellEnd"/>
-      <w:r>
-        <w:t xml:space="preserve"> and protease-coding </w:t>
-      </w:r>
-      <w:proofErr w:type="spellStart"/>
-      <w:r>
-        <w:t>degP</w:t>
-      </w:r>
-      <w:proofErr w:type="spellEnd"/>
-      <w:r>
-        <w:t>, the screen identified genes involved in diverse cellular functions, including outer membrane biogenesis, cell division, and energy metabolism (Murata et al. 2011). Due to their essential nature, none of the genes directly involved in protein synthesis were identified in the screen, but the authors noted reduced expression of 23 genes that participate in protein synthesis. Based on this observation, they concluded that downregulation of ribosomal genes is one of the possible strategies for survival at extremely high growth temperatures.</w:t>
+        <w:t>downregulation of ribosomal genes is one of the possible strategies for survival at extremely high growth temperatures.</w:t>
       </w:r>
     </w:p>
     <w:p>
@@ -3287,6 +3792,119 @@
     </w:lvl>
   </w:abstractNum>
   <w:abstractNum w:abstractNumId="1" w15:restartNumberingAfterBreak="0">
+    <w:nsid w:val="13862FB5"/>
+    <w:multiLevelType w:val="multilevel"/>
+    <w:tmpl w:val="F4C609D4"/>
+    <w:lvl w:ilvl="0">
+      <w:start w:val="1"/>
+      <w:numFmt w:val="decimal"/>
+      <w:lvlText w:val="%1."/>
+      <w:lvlJc w:val="left"/>
+      <w:pPr>
+        <w:tabs>
+          <w:tab w:val="num" w:pos="720"/>
+        </w:tabs>
+        <w:ind w:left="720" w:hanging="360"/>
+      </w:pPr>
+    </w:lvl>
+    <w:lvl w:ilvl="1" w:tentative="1">
+      <w:start w:val="1"/>
+      <w:numFmt w:val="decimal"/>
+      <w:lvlText w:val="%2."/>
+      <w:lvlJc w:val="left"/>
+      <w:pPr>
+        <w:tabs>
+          <w:tab w:val="num" w:pos="1440"/>
+        </w:tabs>
+        <w:ind w:left="1440" w:hanging="360"/>
+      </w:pPr>
+    </w:lvl>
+    <w:lvl w:ilvl="2" w:tentative="1">
+      <w:start w:val="1"/>
+      <w:numFmt w:val="decimal"/>
+      <w:lvlText w:val="%3."/>
+      <w:lvlJc w:val="left"/>
+      <w:pPr>
+        <w:tabs>
+          <w:tab w:val="num" w:pos="2160"/>
+        </w:tabs>
+        <w:ind w:left="2160" w:hanging="360"/>
+      </w:pPr>
+    </w:lvl>
+    <w:lvl w:ilvl="3" w:tentative="1">
+      <w:start w:val="1"/>
+      <w:numFmt w:val="decimal"/>
+      <w:lvlText w:val="%4."/>
+      <w:lvlJc w:val="left"/>
+      <w:pPr>
+        <w:tabs>
+          <w:tab w:val="num" w:pos="2880"/>
+        </w:tabs>
+        <w:ind w:left="2880" w:hanging="360"/>
+      </w:pPr>
+    </w:lvl>
+    <w:lvl w:ilvl="4" w:tentative="1">
+      <w:start w:val="1"/>
+      <w:numFmt w:val="decimal"/>
+      <w:lvlText w:val="%5."/>
+      <w:lvlJc w:val="left"/>
+      <w:pPr>
+        <w:tabs>
+          <w:tab w:val="num" w:pos="3600"/>
+        </w:tabs>
+        <w:ind w:left="3600" w:hanging="360"/>
+      </w:pPr>
+    </w:lvl>
+    <w:lvl w:ilvl="5" w:tentative="1">
+      <w:start w:val="1"/>
+      <w:numFmt w:val="decimal"/>
+      <w:lvlText w:val="%6."/>
+      <w:lvlJc w:val="left"/>
+      <w:pPr>
+        <w:tabs>
+          <w:tab w:val="num" w:pos="4320"/>
+        </w:tabs>
+        <w:ind w:left="4320" w:hanging="360"/>
+      </w:pPr>
+    </w:lvl>
+    <w:lvl w:ilvl="6" w:tentative="1">
+      <w:start w:val="1"/>
+      <w:numFmt w:val="decimal"/>
+      <w:lvlText w:val="%7."/>
+      <w:lvlJc w:val="left"/>
+      <w:pPr>
+        <w:tabs>
+          <w:tab w:val="num" w:pos="5040"/>
+        </w:tabs>
+        <w:ind w:left="5040" w:hanging="360"/>
+      </w:pPr>
+    </w:lvl>
+    <w:lvl w:ilvl="7" w:tentative="1">
+      <w:start w:val="1"/>
+      <w:numFmt w:val="decimal"/>
+      <w:lvlText w:val="%8."/>
+      <w:lvlJc w:val="left"/>
+      <w:pPr>
+        <w:tabs>
+          <w:tab w:val="num" w:pos="5760"/>
+        </w:tabs>
+        <w:ind w:left="5760" w:hanging="360"/>
+      </w:pPr>
+    </w:lvl>
+    <w:lvl w:ilvl="8" w:tentative="1">
+      <w:start w:val="1"/>
+      <w:numFmt w:val="decimal"/>
+      <w:lvlText w:val="%9."/>
+      <w:lvlJc w:val="left"/>
+      <w:pPr>
+        <w:tabs>
+          <w:tab w:val="num" w:pos="6480"/>
+        </w:tabs>
+        <w:ind w:left="6480" w:hanging="360"/>
+      </w:pPr>
+    </w:lvl>
+  </w:abstractNum>
+  <w:abstractNum w:abstractNumId="2" w15:restartNumberingAfterBreak="0">
     <w:nsid w:val="150B68D8"/>
     <w:multiLevelType w:val="hybridMultilevel"/>
     <w:tmpl w:val="D19CCF9A"/>
@@ -3399,7 +4017,7 @@
       </w:rPr>
     </w:lvl>
   </w:abstractNum>
-  <w:abstractNum w:abstractNumId="2" w15:restartNumberingAfterBreak="0">
+  <w:abstractNum w:abstractNumId="3" w15:restartNumberingAfterBreak="0">
     <w:nsid w:val="1B6C3D9B"/>
     <w:multiLevelType w:val="multilevel"/>
     <w:tmpl w:val="2A28BC88"/>
@@ -3548,7 +4166,7 @@
       </w:rPr>
     </w:lvl>
   </w:abstractNum>
-  <w:abstractNum w:abstractNumId="3" w15:restartNumberingAfterBreak="0">
+  <w:abstractNum w:abstractNumId="4" w15:restartNumberingAfterBreak="0">
     <w:nsid w:val="29130063"/>
     <w:multiLevelType w:val="hybridMultilevel"/>
     <w:tmpl w:val="E9B448E8"/>
@@ -3661,7 +4279,7 @@
       </w:rPr>
     </w:lvl>
   </w:abstractNum>
-  <w:abstractNum w:abstractNumId="4" w15:restartNumberingAfterBreak="0">
+  <w:abstractNum w:abstractNumId="5" w15:restartNumberingAfterBreak="0">
     <w:nsid w:val="51DF303B"/>
     <w:multiLevelType w:val="hybridMultilevel"/>
     <w:tmpl w:val="0F62850E"/>
@@ -3774,7 +4392,7 @@
       </w:rPr>
     </w:lvl>
   </w:abstractNum>
-  <w:abstractNum w:abstractNumId="5" w15:restartNumberingAfterBreak="0">
+  <w:abstractNum w:abstractNumId="6" w15:restartNumberingAfterBreak="0">
     <w:nsid w:val="527775B1"/>
     <w:multiLevelType w:val="hybridMultilevel"/>
     <w:tmpl w:val="A1FCE6CA"/>
@@ -3887,7 +4505,7 @@
       </w:rPr>
     </w:lvl>
   </w:abstractNum>
-  <w:abstractNum w:abstractNumId="6" w15:restartNumberingAfterBreak="0">
+  <w:abstractNum w:abstractNumId="7" w15:restartNumberingAfterBreak="0">
     <w:nsid w:val="579A64AE"/>
     <w:multiLevelType w:val="hybridMultilevel"/>
     <w:tmpl w:val="61C084EC"/>
@@ -4001,13 +4619,13 @@
     </w:lvl>
   </w:abstractNum>
   <w:num w:numId="1" w16cid:durableId="662976453">
-    <w:abstractNumId w:val="2"/>
+    <w:abstractNumId w:val="3"/>
   </w:num>
   <w:num w:numId="2" w16cid:durableId="1395201590">
-    <w:abstractNumId w:val="5"/>
+    <w:abstractNumId w:val="6"/>
   </w:num>
   <w:num w:numId="3" w16cid:durableId="1318462571">
-    <w:abstractNumId w:val="6"/>
+    <w:abstractNumId w:val="7"/>
   </w:num>
   <w:num w:numId="4" w16cid:durableId="47732641">
     <w:abstractNumId w:val="0"/>
@@ -4016,13 +4634,19 @@
     </w:lvlOverride>
   </w:num>
   <w:num w:numId="5" w16cid:durableId="1185482195">
-    <w:abstractNumId w:val="3"/>
+    <w:abstractNumId w:val="4"/>
   </w:num>
   <w:num w:numId="6" w16cid:durableId="1363507593">
-    <w:abstractNumId w:val="4"/>
+    <w:abstractNumId w:val="5"/>
   </w:num>
   <w:num w:numId="7" w16cid:durableId="1304578736">
+    <w:abstractNumId w:val="2"/>
+  </w:num>
+  <w:num w:numId="8" w16cid:durableId="342711913">
     <w:abstractNumId w:val="1"/>
+    <w:lvlOverride w:ilvl="0">
+      <w:startOverride w:val="1"/>
+    </w:lvlOverride>
   </w:num>
 </w:numbering>
 </file>

</xml_diff>